<commit_message>
docs: add Sarel Cohen to BMC author metadata
</commit_message>
<xml_diff>
--- a/paper/bmc_bioinformatics/final/Cover_Letter_BMC_Bioinformatics.docx
+++ b/paper/bmc_bioinformatics/final/Cover_Letter_BMC_Bioinformatics.docx
@@ -97,7 +97,7 @@
           <w:i w:val="0"/>
           <w:sz w:val="24"/>
         </w:rPr>
-        <w:t>The author declares no competing interests. [AUTHOR CONFIRMATION REQUIRED] All authors have approved the manuscript and its submission. [AUTHOR CONFIRMATION REQUIRED] The manuscript has not been published or submitted elsewhere. [AUTHOR CONFIRMATION REQUIRED]</w:t>
+        <w:t>The authors declare no competing interests. [AUTHOR CONFIRMATION REQUIRED] All authors have approved the manuscript and its submission. [AUTHOR CONFIRMATION REQUIRED] The manuscript has not been published or submitted elsewhere. [AUTHOR CONFIRMATION REQUIRED]</w:t>
       </w:r>
     </w:p>
     <w:p>
@@ -115,9 +115,11 @@
         <w:br/>
         <w:t>Ron Nuriel</w:t>
         <w:br/>
-        <w:t>[AFFILIATION REQUIRED]</w:t>
+        <w:t>Corresponding author, on behalf of all authors</w:t>
         <w:br/>
-        <w:t>[EMAIL REQUIRED]</w:t>
+        <w:t>[AFFILIATION 1 REQUIRED]</w:t>
+        <w:br/>
+        <w:t>ron.nuriel01@post.runi.ac.il</w:t>
       </w:r>
     </w:p>
     <w:sectPr>

</xml_diff>